<commit_message>
docs: swap V5.1 embedded figures to audited palette set; fix Fig.6 panel lettering (CHG-FIG13)
- All six embedded figures replaced with the audited PNGs (both EN and ZH)
- Display extents updated where aspect changed: Fig.5 5.83x2.51 in, Fig.6 5.83x7.13 in
- Fig. 6 caption panel letters realigned to the in-image titles (A calibration-only,
  B train+calibration, C three-arm) - was off by one since the original layout
- Fig. 4 caption: note added that the two coincident weighted-CP stars at
  (0 labels, 1.00) are offset horizontally for visibility
- Prose check against the corrected Fig.3 data: all decoupling numbers are
  CSV-derived and unchanged (11/12 comparator coverage higher, AUC lower in 12/12)
</commit_message>
<xml_diff>
--- a/reports/Typing_PD(V5.1).docx
+++ b/reports/Typing_PD(V5.1).docx
@@ -2122,6 +2122,9 @@
       <w:r>
         <w:t xml:space="preserve">Recovery-cost curves. Open markers = degenerate full-set calibration (m&lt;9); stars = weighted CP at 0 labels (rejection 0.86–1.00): coverage without utility. Non-monotonic segments reflect single-draw sampling noise (pre-declared). Audit 0.80 = pre-specified operational audit threshold</w:t>
       </w:r>
+      <w:r>
+        <w:t xml:space="preserve"> The Tappy→MIT and MIT→Tappy weighted-CP stars coincide at (0 labels, coverage 1.00) and are offset horizontally for visibility.</w:t>
+      </w:r>
     </w:p>
     <w:p>
       <w:pPr>
@@ -2203,7 +2206,7 @@
       <w:r>
         <w:drawing>
           <wp:inline>
-            <wp:extent cx="5334000" cy="2148416"/>
+            <wp:extent cx="5334000" cy="2296583"/>
             <wp:effectExtent b="0" l="0" r="0" t="0"/>
             <wp:docPr descr="Fig5" title="" id="48" name="Picture"/>
             <a:graphic>
@@ -2260,14 +2263,10 @@
           <w:b/>
           <w:bCs/>
         </w:rPr>
-        <w:t xml:space="preserve">Fig. 6</w:t>
-      </w:r>
-      <w:r>
-        <w:t xml:space="preserve"> </w:t>
-      </w:r>
-      <w:r>
-        <w:t xml:space="preserve">Controlled stress tests, Tappy→MIT direction. A: synthetic label-flip dose–response on the clinical source (left: calibration-only, theory-aligned; right: train+calibration, deployment). B: three-arm real-transfer test — PD/HC-conditional coverage for the observed phenotype vs prevalence re-matching (pool level), prevalence-preserving flips and their combination (train+calibration scope). Shaded bands indicate the pre-specified ±5 percentage-point practical-equivalence tolerance around the observed phenotype; they are not confidence intervals</w:t>
-      </w:r>
+        <w:t>Fig. 6 Controlled stress tests, Tappy→MIT direction. A: calibration-only synthetic label-flip dose–response on the clinical source (theory-aligned). B: train+calibration label flips (deployment reading). C: three-arm real-transfer test — PD/HC-conditional coverage for the observed phenotype vs prevalence re-matching (pool level), prevalence-preserving flips and their combination (train+calibration scope). Shaded bands indicate the pre-specified ±5 percentage-point practical-equivalence tolerance around the observed phenotype; they are not confidence intervals</w:t>
+      </w:r>
+      <w:r/>
+      <w:r/>
     </w:p>
     <w:p>
       <w:pPr>
@@ -2276,7 +2275,7 @@
       <w:r>
         <w:drawing>
           <wp:inline>
-            <wp:extent cx="5334000" cy="4148666"/>
+            <wp:extent cx="5334000" cy="6518667"/>
             <wp:effectExtent b="0" l="0" r="0" t="0"/>
             <wp:docPr descr="Fig6" title="" id="51" name="Picture"/>
             <a:graphic>

</xml_diff>

<commit_message>
Sync: per-figure palettes + audit-driven figure fixes (CHG-FIG13)
- fig3 correctness fix: LGBM panel had plotted LR columns since the original
  script; now reads the true LGBM decoupling coordinates
- fig6 fix: panels A/B now carry distinct scopes (A calibration-only,
  B train+calibration); x ticks/xlabel restored
- fig4: coincident weighted-CP stars dodged; marker legend completed
- fig7: in-image title removed; canvas tightened; old transfer_heatmap.png removed
- V5.1 docx (EN/ZH): embedded figures swapped, Fig.6 caption panel letters
  realigned, Fig.4 star-dodge note added
- PROVENANCE.md chain extended to e31bfed (104 commits)
</commit_message>
<xml_diff>
--- a/reports/Typing_PD(V5.1).docx
+++ b/reports/Typing_PD(V5.1).docx
@@ -2122,6 +2122,9 @@
       <w:r>
         <w:t xml:space="preserve">Recovery-cost curves. Open markers = degenerate full-set calibration (m&lt;9); stars = weighted CP at 0 labels (rejection 0.86–1.00): coverage without utility. Non-monotonic segments reflect single-draw sampling noise (pre-declared). Audit 0.80 = pre-specified operational audit threshold</w:t>
       </w:r>
+      <w:r>
+        <w:t xml:space="preserve"> The Tappy→MIT and MIT→Tappy weighted-CP stars coincide at (0 labels, coverage 1.00) and are offset horizontally for visibility.</w:t>
+      </w:r>
     </w:p>
     <w:p>
       <w:pPr>
@@ -2203,7 +2206,7 @@
       <w:r>
         <w:drawing>
           <wp:inline>
-            <wp:extent cx="5334000" cy="2148416"/>
+            <wp:extent cx="5334000" cy="2296583"/>
             <wp:effectExtent b="0" l="0" r="0" t="0"/>
             <wp:docPr descr="Fig5" title="" id="48" name="Picture"/>
             <a:graphic>
@@ -2260,14 +2263,10 @@
           <w:b/>
           <w:bCs/>
         </w:rPr>
-        <w:t xml:space="preserve">Fig. 6</w:t>
-      </w:r>
-      <w:r>
-        <w:t xml:space="preserve"> </w:t>
-      </w:r>
-      <w:r>
-        <w:t xml:space="preserve">Controlled stress tests, Tappy→MIT direction. A: synthetic label-flip dose–response on the clinical source (left: calibration-only, theory-aligned; right: train+calibration, deployment). B: three-arm real-transfer test — PD/HC-conditional coverage for the observed phenotype vs prevalence re-matching (pool level), prevalence-preserving flips and their combination (train+calibration scope). Shaded bands indicate the pre-specified ±5 percentage-point practical-equivalence tolerance around the observed phenotype; they are not confidence intervals</w:t>
-      </w:r>
+        <w:t>Fig. 6 Controlled stress tests, Tappy→MIT direction. A: calibration-only synthetic label-flip dose–response on the clinical source (theory-aligned). B: train+calibration label flips (deployment reading). C: three-arm real-transfer test — PD/HC-conditional coverage for the observed phenotype vs prevalence re-matching (pool level), prevalence-preserving flips and their combination (train+calibration scope). Shaded bands indicate the pre-specified ±5 percentage-point practical-equivalence tolerance around the observed phenotype; they are not confidence intervals</w:t>
+      </w:r>
+      <w:r/>
+      <w:r/>
     </w:p>
     <w:p>
       <w:pPr>
@@ -2276,7 +2275,7 @@
       <w:r>
         <w:drawing>
           <wp:inline>
-            <wp:extent cx="5334000" cy="4148666"/>
+            <wp:extent cx="5334000" cy="6518667"/>
             <wp:effectExtent b="0" l="0" r="0" t="0"/>
             <wp:docPr descr="Fig6" title="" id="51" name="Picture"/>
             <a:graphic>

</xml_diff>